<commit_message>
Add real-data evaluation and stricter Groq outputs
</commit_message>
<xml_diff>
--- a/docs/BCT_Solution_Paper.docx
+++ b/docs/BCT_Solution_Paper.docx
@@ -219,6 +219,57 @@
       </w:pPr>
       <w:r>
         <w:t>2. Architecture</w:t>
+      </w:r>
+    </w:p>
+    <w:p>
+      <w:pPr>
+        <w:jc w:val="center"/>
+      </w:pPr>
+      <w:r>
+        <w:drawing>
+          <wp:inline xmlns:a="http://schemas.openxmlformats.org/drawingml/2006/main" xmlns:pic="http://schemas.openxmlformats.org/drawingml/2006/picture">
+            <wp:extent cx="5897880" cy="2801493"/>
+            <wp:docPr id="1" name="Picture 1"/>
+            <wp:cNvGraphicFramePr>
+              <a:graphicFrameLocks noChangeAspect="1"/>
+            </wp:cNvGraphicFramePr>
+            <a:graphic>
+              <a:graphicData uri="http://schemas.openxmlformats.org/drawingml/2006/picture">
+                <pic:pic>
+                  <pic:nvPicPr>
+                    <pic:cNvPr id="0" name="architecture.png"/>
+                    <pic:cNvPicPr/>
+                  </pic:nvPicPr>
+                  <pic:blipFill>
+                    <a:blip r:embed="rId11"/>
+                    <a:stretch>
+                      <a:fillRect/>
+                    </a:stretch>
+                  </pic:blipFill>
+                  <pic:spPr>
+                    <a:xfrm>
+                      <a:off x="0" y="0"/>
+                      <a:ext cx="5897880" cy="2801493"/>
+                    </a:xfrm>
+                    <a:prstGeom prst="rect"/>
+                  </pic:spPr>
+                </pic:pic>
+              </a:graphicData>
+            </a:graphic>
+          </wp:inline>
+        </w:drawing>
+      </w:r>
+    </w:p>
+    <w:p>
+      <w:pPr>
+        <w:jc w:val="center"/>
+      </w:pPr>
+      <w:r>
+        <w:rPr>
+          <w:color w:val="5F5B53"/>
+          <w:sz w:val="18"/>
+        </w:rPr>
+        <w:t>Figure 1. The app keeps behavioral scoring local and uses Groq only after structured validation.</w:t>
       </w:r>
     </w:p>
     <w:tbl>
@@ -589,11 +640,6 @@
       </w:r>
     </w:p>
     <w:p>
-      <w:r>
-        <w:br w:type="page"/>
-      </w:r>
-    </w:p>
-    <w:p>
       <w:pPr>
         <w:pStyle w:val="Heading1"/>
       </w:pPr>
@@ -633,6 +679,312 @@
         <w:t>Cold-start support: when history is sparse, rely more heavily on item metadata, popularity, context text, and stated persona preferences.</w:t>
       </w:r>
     </w:p>
+    <w:tbl>
+      <w:tblPr>
+        <w:tblStyle w:val="TableGrid"/>
+        <w:tblW w:type="auto" w:w="0"/>
+        <w:jc w:val="left"/>
+        <w:tblLook w:firstColumn="1" w:firstRow="1" w:lastColumn="0" w:lastRow="0" w:noHBand="0" w:noVBand="1" w:val="04A0"/>
+      </w:tblPr>
+      <w:tblGrid>
+        <w:gridCol w:w="3120"/>
+        <w:gridCol w:w="3120"/>
+        <w:gridCol w:w="3120"/>
+      </w:tblGrid>
+      <w:tr>
+        <w:trPr>
+          <w:tblHeader w:val="true"/>
+          <w:cantSplit/>
+        </w:trPr>
+        <w:tc>
+          <w:tcPr>
+            <w:tcW w:type="dxa" w:w="2448"/>
+            <w:shd w:fill="EDE3D3"/>
+            <w:tcMar>
+              <w:top w:w="90" w:type="dxa"/>
+              <w:start w:w="120" w:type="dxa"/>
+              <w:bottom w:w="90" w:type="dxa"/>
+              <w:end w:w="120" w:type="dxa"/>
+            </w:tcMar>
+            <w:vAlign w:val="center"/>
+          </w:tcPr>
+          <w:p>
+            <w:r>
+              <w:rPr>
+                <w:b/>
+              </w:rPr>
+              <w:t>Smoke Subset</w:t>
+            </w:r>
+          </w:p>
+        </w:tc>
+        <w:tc>
+          <w:tcPr>
+            <w:tcW w:type="dxa" w:w="2015"/>
+            <w:shd w:fill="EDE3D3"/>
+            <w:tcMar>
+              <w:top w:w="90" w:type="dxa"/>
+              <w:start w:w="120" w:type="dxa"/>
+              <w:bottom w:w="90" w:type="dxa"/>
+              <w:end w:w="120" w:type="dxa"/>
+            </w:tcMar>
+            <w:vAlign w:val="center"/>
+          </w:tcPr>
+          <w:p>
+            <w:r>
+              <w:rPr>
+                <w:b/>
+              </w:rPr>
+              <w:t>Value</w:t>
+            </w:r>
+          </w:p>
+        </w:tc>
+        <w:tc>
+          <w:tcPr>
+            <w:tcW w:type="dxa" w:w="4896"/>
+            <w:shd w:fill="EDE3D3"/>
+            <w:tcMar>
+              <w:top w:w="90" w:type="dxa"/>
+              <w:start w:w="120" w:type="dxa"/>
+              <w:bottom w:w="90" w:type="dxa"/>
+              <w:end w:w="120" w:type="dxa"/>
+            </w:tcMar>
+            <w:vAlign w:val="center"/>
+          </w:tcPr>
+          <w:p>
+            <w:r>
+              <w:rPr>
+                <w:b/>
+              </w:rPr>
+              <w:t>Meaning</w:t>
+            </w:r>
+          </w:p>
+        </w:tc>
+      </w:tr>
+      <w:tr>
+        <w:trPr>
+          <w:cantSplit/>
+        </w:trPr>
+        <w:tc>
+          <w:tcPr>
+            <w:tcW w:type="dxa" w:w="2448"/>
+            <w:tcMar>
+              <w:top w:w="90" w:type="dxa"/>
+              <w:start w:w="120" w:type="dxa"/>
+              <w:bottom w:w="90" w:type="dxa"/>
+              <w:end w:w="120" w:type="dxa"/>
+            </w:tcMar>
+            <w:vAlign w:val="center"/>
+          </w:tcPr>
+          <w:p>
+            <w:r>
+              <w:t>Source</w:t>
+            </w:r>
+          </w:p>
+        </w:tc>
+        <w:tc>
+          <w:tcPr>
+            <w:tcW w:type="dxa" w:w="2015"/>
+            <w:tcMar>
+              <w:top w:w="90" w:type="dxa"/>
+              <w:start w:w="120" w:type="dxa"/>
+              <w:bottom w:w="90" w:type="dxa"/>
+              <w:end w:w="120" w:type="dxa"/>
+            </w:tcMar>
+            <w:vAlign w:val="center"/>
+          </w:tcPr>
+          <w:p>
+            <w:r>
+              <w:t>Amazon Reviews 2023</w:t>
+            </w:r>
+          </w:p>
+        </w:tc>
+        <w:tc>
+          <w:tcPr>
+            <w:tcW w:type="dxa" w:w="4896"/>
+            <w:tcMar>
+              <w:top w:w="90" w:type="dxa"/>
+              <w:start w:w="120" w:type="dxa"/>
+              <w:bottom w:w="90" w:type="dxa"/>
+              <w:end w:w="120" w:type="dxa"/>
+            </w:tcMar>
+            <w:vAlign w:val="center"/>
+          </w:tcPr>
+          <w:p>
+            <w:r>
+              <w:t>Official McAuley Lab review and metadata JSONL.GZ files</w:t>
+            </w:r>
+          </w:p>
+        </w:tc>
+      </w:tr>
+      <w:tr>
+        <w:trPr>
+          <w:cantSplit/>
+        </w:trPr>
+        <w:tc>
+          <w:tcPr>
+            <w:tcW w:type="dxa" w:w="2448"/>
+            <w:tcMar>
+              <w:top w:w="90" w:type="dxa"/>
+              <w:start w:w="120" w:type="dxa"/>
+              <w:bottom w:w="90" w:type="dxa"/>
+              <w:end w:w="120" w:type="dxa"/>
+            </w:tcMar>
+            <w:vAlign w:val="center"/>
+          </w:tcPr>
+          <w:p>
+            <w:r>
+              <w:t>Products</w:t>
+            </w:r>
+          </w:p>
+        </w:tc>
+        <w:tc>
+          <w:tcPr>
+            <w:tcW w:type="dxa" w:w="2015"/>
+            <w:tcMar>
+              <w:top w:w="90" w:type="dxa"/>
+              <w:start w:w="120" w:type="dxa"/>
+              <w:bottom w:w="90" w:type="dxa"/>
+              <w:end w:w="120" w:type="dxa"/>
+            </w:tcMar>
+            <w:vAlign w:val="center"/>
+          </w:tcPr>
+          <w:p>
+            <w:r>
+              <w:t>21</w:t>
+            </w:r>
+          </w:p>
+        </w:tc>
+        <w:tc>
+          <w:tcPr>
+            <w:tcW w:type="dxa" w:w="4896"/>
+            <w:tcMar>
+              <w:top w:w="90" w:type="dxa"/>
+              <w:start w:w="120" w:type="dxa"/>
+              <w:bottom w:w="90" w:type="dxa"/>
+              <w:end w:w="120" w:type="dxa"/>
+            </w:tcMar>
+            <w:vAlign w:val="center"/>
+          </w:tcPr>
+          <w:p>
+            <w:r>
+              <w:t>Normalized candidate products in the smoke run</w:t>
+            </w:r>
+          </w:p>
+        </w:tc>
+      </w:tr>
+      <w:tr>
+        <w:trPr>
+          <w:cantSplit/>
+        </w:trPr>
+        <w:tc>
+          <w:tcPr>
+            <w:tcW w:type="dxa" w:w="2448"/>
+            <w:tcMar>
+              <w:top w:w="90" w:type="dxa"/>
+              <w:start w:w="120" w:type="dxa"/>
+              <w:bottom w:w="90" w:type="dxa"/>
+              <w:end w:w="120" w:type="dxa"/>
+            </w:tcMar>
+            <w:vAlign w:val="center"/>
+          </w:tcPr>
+          <w:p>
+            <w:r>
+              <w:t>Reviews</w:t>
+            </w:r>
+          </w:p>
+        </w:tc>
+        <w:tc>
+          <w:tcPr>
+            <w:tcW w:type="dxa" w:w="2015"/>
+            <w:tcMar>
+              <w:top w:w="90" w:type="dxa"/>
+              <w:start w:w="120" w:type="dxa"/>
+              <w:bottom w:w="90" w:type="dxa"/>
+              <w:end w:w="120" w:type="dxa"/>
+            </w:tcMar>
+            <w:vAlign w:val="center"/>
+          </w:tcPr>
+          <w:p>
+            <w:r>
+              <w:t>27</w:t>
+            </w:r>
+          </w:p>
+        </w:tc>
+        <w:tc>
+          <w:tcPr>
+            <w:tcW w:type="dxa" w:w="4896"/>
+            <w:tcMar>
+              <w:top w:w="90" w:type="dxa"/>
+              <w:start w:w="120" w:type="dxa"/>
+              <w:bottom w:w="90" w:type="dxa"/>
+              <w:end w:w="120" w:type="dxa"/>
+            </w:tcMar>
+            <w:vAlign w:val="center"/>
+          </w:tcPr>
+          <w:p>
+            <w:r>
+              <w:t>Real review texts and ratings after filtering</w:t>
+            </w:r>
+          </w:p>
+        </w:tc>
+      </w:tr>
+      <w:tr>
+        <w:trPr>
+          <w:cantSplit/>
+        </w:trPr>
+        <w:tc>
+          <w:tcPr>
+            <w:tcW w:type="dxa" w:w="2448"/>
+            <w:tcMar>
+              <w:top w:w="90" w:type="dxa"/>
+              <w:start w:w="120" w:type="dxa"/>
+              <w:bottom w:w="90" w:type="dxa"/>
+              <w:end w:w="120" w:type="dxa"/>
+            </w:tcMar>
+            <w:vAlign w:val="center"/>
+          </w:tcPr>
+          <w:p>
+            <w:r>
+              <w:t>Users</w:t>
+            </w:r>
+          </w:p>
+        </w:tc>
+        <w:tc>
+          <w:tcPr>
+            <w:tcW w:type="dxa" w:w="2015"/>
+            <w:tcMar>
+              <w:top w:w="90" w:type="dxa"/>
+              <w:start w:w="120" w:type="dxa"/>
+              <w:bottom w:w="90" w:type="dxa"/>
+              <w:end w:w="120" w:type="dxa"/>
+            </w:tcMar>
+            <w:vAlign w:val="center"/>
+          </w:tcPr>
+          <w:p>
+            <w:r>
+              <w:t>8</w:t>
+            </w:r>
+          </w:p>
+        </w:tc>
+        <w:tc>
+          <w:tcPr>
+            <w:tcW w:type="dxa" w:w="4896"/>
+            <w:tcMar>
+              <w:top w:w="90" w:type="dxa"/>
+              <w:start w:w="120" w:type="dxa"/>
+              <w:bottom w:w="90" w:type="dxa"/>
+              <w:end w:w="120" w:type="dxa"/>
+            </w:tcMar>
+            <w:vAlign w:val="center"/>
+          </w:tcPr>
+          <w:p>
+            <w:r>
+              <w:t>Users with enough chronological behavior for holdout testing</w:t>
+            </w:r>
+          </w:p>
+        </w:tc>
+      </w:tr>
+    </w:tbl>
     <w:p>
       <w:pPr>
         <w:pStyle w:val="Heading1"/>
@@ -1004,21 +1356,16 @@
       </w:tr>
     </w:tbl>
     <w:p>
-      <w:r>
-        <w:br w:type="page"/>
-      </w:r>
-    </w:p>
-    <w:p>
       <w:pPr>
         <w:pStyle w:val="Heading1"/>
       </w:pPr>
       <w:r>
-        <w:t>5. Current Fixture Results</w:t>
+        <w:t>5. Current Results</w:t>
       </w:r>
     </w:p>
     <w:p>
       <w:r>
-        <w:t>The checked-in fixture split is intentionally small and should be interpreted as a smoke test, not a final leaderboard score. It verifies that the app, endpoints, and evaluation pipeline are coherent before scaling to the larger Amazon subset.</w:t>
+        <w:t>The repository includes both a hand-checkable fixture split and a real Amazon Reviews 2023 smoke subset. The Amazon smoke subset is still small, but it proves that the same code path can stream official data, normalize metadata, create chronological user splits, and compare personalized models against baselines.</w:t>
       </w:r>
     </w:p>
     <w:tbl>
@@ -1029,9 +1376,10 @@
         <w:tblLook w:firstColumn="1" w:firstRow="1" w:lastColumn="0" w:lastRow="0" w:noHBand="0" w:noVBand="1" w:val="04A0"/>
       </w:tblPr>
       <w:tblGrid>
-        <w:gridCol w:w="3120"/>
-        <w:gridCol w:w="3120"/>
-        <w:gridCol w:w="3120"/>
+        <w:gridCol w:w="2340"/>
+        <w:gridCol w:w="2340"/>
+        <w:gridCol w:w="2340"/>
+        <w:gridCol w:w="2340"/>
       </w:tblGrid>
       <w:tr>
         <w:trPr>
@@ -1061,7 +1409,7 @@
         </w:tc>
         <w:tc>
           <w:tcPr>
-            <w:tcW w:type="dxa" w:w="2015"/>
+            <w:tcW w:type="dxa" w:w="1872"/>
             <w:shd w:fill="EDE3D3"/>
             <w:tcMar>
               <w:top w:w="90" w:type="dxa"/>
@@ -1076,13 +1424,13 @@
               <w:rPr>
                 <w:b/>
               </w:rPr>
-              <w:t>Fixture Result</w:t>
+              <w:t>Personalized</w:t>
             </w:r>
           </w:p>
         </w:tc>
         <w:tc>
           <w:tcPr>
-            <w:tcW w:type="dxa" w:w="4752"/>
+            <w:tcW w:type="dxa" w:w="1872"/>
             <w:shd w:fill="EDE3D3"/>
             <w:tcMar>
               <w:top w:w="90" w:type="dxa"/>
@@ -1097,7 +1445,28 @@
               <w:rPr>
                 <w:b/>
               </w:rPr>
-              <w:t>Interpretation</w:t>
+              <w:t>Baseline</w:t>
+            </w:r>
+          </w:p>
+        </w:tc>
+        <w:tc>
+          <w:tcPr>
+            <w:tcW w:type="dxa" w:w="3024"/>
+            <w:shd w:fill="EDE3D3"/>
+            <w:tcMar>
+              <w:top w:w="90" w:type="dxa"/>
+              <w:start w:w="120" w:type="dxa"/>
+              <w:bottom w:w="90" w:type="dxa"/>
+              <w:end w:w="120" w:type="dxa"/>
+            </w:tcMar>
+            <w:vAlign w:val="center"/>
+          </w:tcPr>
+          <w:p>
+            <w:r>
+              <w:rPr>
+                <w:b/>
+              </w:rPr>
+              <w:t>Lift</w:t>
             </w:r>
           </w:p>
         </w:tc>
@@ -1125,7 +1494,7 @@
         </w:tc>
         <w:tc>
           <w:tcPr>
-            <w:tcW w:type="dxa" w:w="2015"/>
+            <w:tcW w:type="dxa" w:w="1872"/>
             <w:tcMar>
               <w:top w:w="90" w:type="dxa"/>
               <w:start w:w="120" w:type="dxa"/>
@@ -1136,13 +1505,13 @@
           </w:tcPr>
           <w:p>
             <w:r>
-              <w:t>0.507</w:t>
+              <w:t>0.8734</w:t>
             </w:r>
           </w:p>
         </w:tc>
         <w:tc>
           <w:tcPr>
-            <w:tcW w:type="dxa" w:w="4752"/>
+            <w:tcW w:type="dxa" w:w="1872"/>
             <w:tcMar>
               <w:top w:w="90" w:type="dxa"/>
               <w:start w:w="120" w:type="dxa"/>
@@ -1153,18 +1522,13 @@
           </w:tcPr>
           <w:p>
             <w:r>
-              <w:t>Rating predictor is stable on the smoke split</w:t>
+              <w:t>1.3935</w:t>
             </w:r>
           </w:p>
         </w:tc>
-      </w:tr>
-      <w:tr>
-        <w:trPr>
-          <w:cantSplit/>
-        </w:trPr>
         <w:tc>
           <w:tcPr>
-            <w:tcW w:type="dxa" w:w="2592"/>
+            <w:tcW w:type="dxa" w:w="3024"/>
             <w:tcMar>
               <w:top w:w="90" w:type="dxa"/>
               <w:start w:w="120" w:type="dxa"/>
@@ -1175,41 +1539,7 @@
           </w:tcPr>
           <w:p>
             <w:r>
-              <w:t>Task A ROUGE-L</w:t>
-            </w:r>
-          </w:p>
-        </w:tc>
-        <w:tc>
-          <w:tcPr>
-            <w:tcW w:type="dxa" w:w="2015"/>
-            <w:tcMar>
-              <w:top w:w="90" w:type="dxa"/>
-              <w:start w:w="120" w:type="dxa"/>
-              <w:bottom w:w="90" w:type="dxa"/>
-              <w:end w:w="120" w:type="dxa"/>
-            </w:tcMar>
-            <w:vAlign w:val="center"/>
-          </w:tcPr>
-          <w:p>
-            <w:r>
-              <w:t>0.418</w:t>
-            </w:r>
-          </w:p>
-        </w:tc>
-        <w:tc>
-          <w:tcPr>
-            <w:tcW w:type="dxa" w:w="4752"/>
-            <w:tcMar>
-              <w:top w:w="90" w:type="dxa"/>
-              <w:start w:w="120" w:type="dxa"/>
-              <w:bottom w:w="90" w:type="dxa"/>
-              <w:end w:w="120" w:type="dxa"/>
-            </w:tcMar>
-            <w:vAlign w:val="center"/>
-          </w:tcPr>
-          <w:p>
-            <w:r>
-              <w:t>Placeholder fixture score unless optional NLP metrics are installed</w:t>
+              <w:t>0.5201</w:t>
             </w:r>
           </w:p>
         </w:tc>
@@ -1237,7 +1567,7 @@
         </w:tc>
         <w:tc>
           <w:tcPr>
-            <w:tcW w:type="dxa" w:w="2015"/>
+            <w:tcW w:type="dxa" w:w="1872"/>
             <w:tcMar>
               <w:top w:w="90" w:type="dxa"/>
               <w:start w:w="120" w:type="dxa"/>
@@ -1248,13 +1578,13 @@
           </w:tcPr>
           <w:p>
             <w:r>
-              <w:t>0.810</w:t>
+              <w:t>0.1879</w:t>
             </w:r>
           </w:p>
         </w:tc>
         <w:tc>
           <w:tcPr>
-            <w:tcW w:type="dxa" w:w="4752"/>
+            <w:tcW w:type="dxa" w:w="1872"/>
             <w:tcMar>
               <w:top w:w="90" w:type="dxa"/>
               <w:start w:w="120" w:type="dxa"/>
@@ -1265,7 +1595,24 @@
           </w:tcPr>
           <w:p>
             <w:r>
-              <w:t>Held-out items are ranked near the top</w:t>
+              <w:t>0.0413</w:t>
+            </w:r>
+          </w:p>
+        </w:tc>
+        <w:tc>
+          <w:tcPr>
+            <w:tcW w:type="dxa" w:w="3024"/>
+            <w:tcMar>
+              <w:top w:w="90" w:type="dxa"/>
+              <w:start w:w="120" w:type="dxa"/>
+              <w:bottom w:w="90" w:type="dxa"/>
+              <w:end w:w="120" w:type="dxa"/>
+            </w:tcMar>
+            <w:vAlign w:val="center"/>
+          </w:tcPr>
+          <w:p>
+            <w:r>
+              <w:t>0.1466</w:t>
             </w:r>
           </w:p>
         </w:tc>
@@ -1293,7 +1640,7 @@
         </w:tc>
         <w:tc>
           <w:tcPr>
-            <w:tcW w:type="dxa" w:w="2015"/>
+            <w:tcW w:type="dxa" w:w="1872"/>
             <w:tcMar>
               <w:top w:w="90" w:type="dxa"/>
               <w:start w:w="120" w:type="dxa"/>
@@ -1304,13 +1651,13 @@
           </w:tcPr>
           <w:p>
             <w:r>
-              <w:t>1.000</w:t>
+              <w:t>0.2857</w:t>
             </w:r>
           </w:p>
         </w:tc>
         <w:tc>
           <w:tcPr>
-            <w:tcW w:type="dxa" w:w="4752"/>
+            <w:tcW w:type="dxa" w:w="1872"/>
             <w:tcMar>
               <w:top w:w="90" w:type="dxa"/>
               <w:start w:w="120" w:type="dxa"/>
@@ -1321,12 +1668,34 @@
           </w:tcPr>
           <w:p>
             <w:r>
-              <w:t>Every held-out item appears in the top ten</w:t>
+              <w:t>0.1429</w:t>
+            </w:r>
+          </w:p>
+        </w:tc>
+        <w:tc>
+          <w:tcPr>
+            <w:tcW w:type="dxa" w:w="3024"/>
+            <w:tcMar>
+              <w:top w:w="90" w:type="dxa"/>
+              <w:start w:w="120" w:type="dxa"/>
+              <w:bottom w:w="90" w:type="dxa"/>
+              <w:end w:w="120" w:type="dxa"/>
+            </w:tcMar>
+            <w:vAlign w:val="center"/>
+          </w:tcPr>
+          <w:p>
+            <w:r>
+              <w:t>Personalized ranker doubles recovery in the smoke subset</w:t>
             </w:r>
           </w:p>
         </w:tc>
       </w:tr>
     </w:tbl>
+    <w:p>
+      <w:r>
+        <w:t>The most important signal is not the absolute value of the smoke score; it is the direction of the ablation. Personalized rating and ranking beat non-personalized baselines on the same held-out interactions.</w:t>
+      </w:r>
+    </w:p>
     <w:p>
       <w:pPr>
         <w:pStyle w:val="Heading1"/>
@@ -1337,7 +1706,7 @@
     </w:p>
     <w:p>
       <w:r>
-        <w:t>The system includes Nigerian contextual signals without forcing slang or stereotypes. Location, budget, family role, language preference, weather, transport cost, and local media taste influence the final output only where they naturally affect value and choice.</w:t>
+        <w:t>Nigerian context is used only where it changes value, convenience, budget, family use, weather, or media taste.</w:t>
       </w:r>
     </w:p>
     <w:tbl>
@@ -1455,7 +1824,7 @@
           </w:tcPr>
           <w:p>
             <w:r>
-              <w:t>Low budget, classes, friends, transport cost</w:t>
+              <w:t>Low budget, classes, transport cost</w:t>
             </w:r>
           </w:p>
         </w:tc>
@@ -1472,7 +1841,7 @@
           </w:tcPr>
           <w:p>
             <w:r>
-              <w:t>Prioritizes quick meals, value, local comedy, and multiplayer entertainment</w:t>
+              <w:t>Quick meals, value, local comedy, and multiplayer games</w:t>
             </w:r>
           </w:p>
         </w:tc>
@@ -1528,63 +1897,7 @@
           </w:tcPr>
           <w:p>
             <w:r>
-              <w:t>Prefers dependable coffee, political drama, and lightweight skincare</w:t>
-            </w:r>
-          </w:p>
-        </w:tc>
-      </w:tr>
-      <w:tr>
-        <w:trPr>
-          <w:cantSplit/>
-        </w:trPr>
-        <w:tc>
-          <w:tcPr>
-            <w:tcW w:type="dxa" w:w="2592"/>
-            <w:tcMar>
-              <w:top w:w="90" w:type="dxa"/>
-              <w:start w:w="120" w:type="dxa"/>
-              <w:bottom w:w="90" w:type="dxa"/>
-              <w:end w:w="120" w:type="dxa"/>
-            </w:tcMar>
-            <w:vAlign w:val="center"/>
-          </w:tcPr>
-          <w:p>
-            <w:r>
-              <w:t>Port Harcourt family shopper</w:t>
-            </w:r>
-          </w:p>
-        </w:tc>
-        <w:tc>
-          <w:tcPr>
-            <w:tcW w:type="dxa" w:w="3311"/>
-            <w:tcMar>
-              <w:top w:w="90" w:type="dxa"/>
-              <w:start w:w="120" w:type="dxa"/>
-              <w:bottom w:w="90" w:type="dxa"/>
-              <w:end w:w="120" w:type="dxa"/>
-            </w:tcMar>
-            <w:vAlign w:val="center"/>
-          </w:tcPr>
-          <w:p>
-            <w:r>
-              <w:t>Home use, visitors, children, reliability</w:t>
-            </w:r>
-          </w:p>
-        </w:tc>
-        <w:tc>
-          <w:tcPr>
-            <w:tcW w:type="dxa" w:w="3456"/>
-            <w:tcMar>
-              <w:top w:w="90" w:type="dxa"/>
-              <w:start w:w="120" w:type="dxa"/>
-              <w:bottom w:w="90" w:type="dxa"/>
-              <w:end w:w="120" w:type="dxa"/>
-            </w:tcMar>
-            <w:vAlign w:val="center"/>
-          </w:tcPr>
-          <w:p>
-            <w:r>
-              <w:t>Prefers family-safe media, easy drinks for guests, and gentle skincare</w:t>
+              <w:t>Dependable coffee, political drama, and lightweight skincare</w:t>
             </w:r>
           </w:p>
         </w:tc>
@@ -1592,7 +1905,7 @@
     </w:tbl>
     <w:p>
       <w:r>
-        <w:br w:type="page"/>
+        <w:t>A third demo persona, a Port Harcourt family shopper, covers home use, visitors, children, family-safe media, easy guest drinks, and gentle skincare.</w:t>
       </w:r>
     </w:p>
     <w:p>
@@ -1600,7 +1913,196 @@
         <w:pStyle w:val="Heading1"/>
       </w:pPr>
       <w:r>
-        <w:t>7. Reproducibility and Deployment</w:t>
+        <w:t>7. Product Demo Screens</w:t>
+      </w:r>
+    </w:p>
+    <w:p>
+      <w:r>
+        <w:t>The submitted application is designed for judge inspection. The landing page explains the agent promise, Task A exposes the simulated review workflow, and Task B exposes the ranked recommendation workflow.</w:t>
+      </w:r>
+    </w:p>
+    <w:p>
+      <w:pPr>
+        <w:jc w:val="center"/>
+      </w:pPr>
+      <w:r>
+        <w:drawing>
+          <wp:inline xmlns:a="http://schemas.openxmlformats.org/drawingml/2006/main" xmlns:pic="http://schemas.openxmlformats.org/drawingml/2006/picture">
+            <wp:extent cx="5303520" cy="3683000"/>
+            <wp:docPr id="2" name="Picture 2"/>
+            <wp:cNvGraphicFramePr>
+              <a:graphicFrameLocks noChangeAspect="1"/>
+            </wp:cNvGraphicFramePr>
+            <a:graphic>
+              <a:graphicData uri="http://schemas.openxmlformats.org/drawingml/2006/picture">
+                <pic:pic>
+                  <pic:nvPicPr>
+                    <pic:cNvPr id="0" name="landing.png"/>
+                    <pic:cNvPicPr/>
+                  </pic:nvPicPr>
+                  <pic:blipFill>
+                    <a:blip r:embed="rId12"/>
+                    <a:stretch>
+                      <a:fillRect/>
+                    </a:stretch>
+                  </pic:blipFill>
+                  <pic:spPr>
+                    <a:xfrm>
+                      <a:off x="0" y="0"/>
+                      <a:ext cx="5303520" cy="3683000"/>
+                    </a:xfrm>
+                    <a:prstGeom prst="rect"/>
+                  </pic:spPr>
+                </pic:pic>
+              </a:graphicData>
+            </a:graphic>
+          </wp:inline>
+        </w:drawing>
+      </w:r>
+    </w:p>
+    <w:p>
+      <w:pPr>
+        <w:jc w:val="center"/>
+      </w:pPr>
+      <w:r>
+        <w:rPr>
+          <w:color w:val="5F5B53"/>
+          <w:sz w:val="18"/>
+        </w:rPr>
+        <w:t>Figure 2. Landing page for the judge-facing agent studio.</w:t>
+      </w:r>
+    </w:p>
+    <w:tbl>
+      <w:tblPr>
+        <w:tblW w:type="auto" w:w="0"/>
+        <w:jc w:val="left"/>
+        <w:tblLook w:firstColumn="1" w:firstRow="1" w:lastColumn="0" w:lastRow="0" w:noHBand="0" w:noVBand="1" w:val="04A0"/>
+      </w:tblPr>
+      <w:tblGrid>
+        <w:gridCol w:w="4680"/>
+        <w:gridCol w:w="4680"/>
+      </w:tblGrid>
+      <w:tr>
+        <w:tc>
+          <w:tcPr>
+            <w:tcW w:type="dxa" w:w="4680"/>
+            <w:tcMar>
+              <w:top w:w="30" w:type="dxa"/>
+              <w:start w:w="30" w:type="dxa"/>
+              <w:bottom w:w="30" w:type="dxa"/>
+              <w:end w:w="30" w:type="dxa"/>
+            </w:tcMar>
+          </w:tcPr>
+          <w:p>
+            <w:pPr>
+              <w:jc w:val="center"/>
+            </w:pPr>
+            <w:r>
+              <w:drawing>
+                <wp:inline xmlns:a="http://schemas.openxmlformats.org/drawingml/2006/main" xmlns:pic="http://schemas.openxmlformats.org/drawingml/2006/picture">
+                  <wp:extent cx="2788920" cy="1936750"/>
+                  <wp:docPr id="3" name="Picture 3"/>
+                  <wp:cNvGraphicFramePr>
+                    <a:graphicFrameLocks noChangeAspect="1"/>
+                  </wp:cNvGraphicFramePr>
+                  <a:graphic>
+                    <a:graphicData uri="http://schemas.openxmlformats.org/drawingml/2006/picture">
+                      <pic:pic>
+                        <pic:nvPicPr>
+                          <pic:cNvPr id="0" name="task_a.png"/>
+                          <pic:cNvPicPr/>
+                        </pic:nvPicPr>
+                        <pic:blipFill>
+                          <a:blip r:embed="rId13"/>
+                          <a:stretch>
+                            <a:fillRect/>
+                          </a:stretch>
+                        </pic:blipFill>
+                        <pic:spPr>
+                          <a:xfrm>
+                            <a:off x="0" y="0"/>
+                            <a:ext cx="2788920" cy="1936750"/>
+                          </a:xfrm>
+                          <a:prstGeom prst="rect"/>
+                        </pic:spPr>
+                      </pic:pic>
+                    </a:graphicData>
+                  </a:graphic>
+                </wp:inline>
+              </w:drawing>
+            </w:r>
+          </w:p>
+        </w:tc>
+        <w:tc>
+          <w:tcPr>
+            <w:tcW w:type="dxa" w:w="4680"/>
+            <w:tcMar>
+              <w:top w:w="30" w:type="dxa"/>
+              <w:start w:w="30" w:type="dxa"/>
+              <w:bottom w:w="30" w:type="dxa"/>
+              <w:end w:w="30" w:type="dxa"/>
+            </w:tcMar>
+          </w:tcPr>
+          <w:p>
+            <w:pPr>
+              <w:jc w:val="center"/>
+            </w:pPr>
+            <w:r>
+              <w:drawing>
+                <wp:inline xmlns:a="http://schemas.openxmlformats.org/drawingml/2006/main" xmlns:pic="http://schemas.openxmlformats.org/drawingml/2006/picture">
+                  <wp:extent cx="2788920" cy="1936750"/>
+                  <wp:docPr id="4" name="Picture 4"/>
+                  <wp:cNvGraphicFramePr>
+                    <a:graphicFrameLocks noChangeAspect="1"/>
+                  </wp:cNvGraphicFramePr>
+                  <a:graphic>
+                    <a:graphicData uri="http://schemas.openxmlformats.org/drawingml/2006/picture">
+                      <pic:pic>
+                        <pic:nvPicPr>
+                          <pic:cNvPr id="0" name="task_b.png"/>
+                          <pic:cNvPicPr/>
+                        </pic:nvPicPr>
+                        <pic:blipFill>
+                          <a:blip r:embed="rId14"/>
+                          <a:stretch>
+                            <a:fillRect/>
+                          </a:stretch>
+                        </pic:blipFill>
+                        <pic:spPr>
+                          <a:xfrm>
+                            <a:off x="0" y="0"/>
+                            <a:ext cx="2788920" cy="1936750"/>
+                          </a:xfrm>
+                          <a:prstGeom prst="rect"/>
+                        </pic:spPr>
+                      </pic:pic>
+                    </a:graphicData>
+                  </a:graphic>
+                </wp:inline>
+              </w:drawing>
+            </w:r>
+          </w:p>
+        </w:tc>
+      </w:tr>
+    </w:tbl>
+    <w:p>
+      <w:pPr>
+        <w:jc w:val="center"/>
+      </w:pPr>
+      <w:r>
+        <w:rPr>
+          <w:color w:val="5F5B53"/>
+          <w:sz w:val="18"/>
+        </w:rPr>
+        <w:t>Figure 3. Task A and Task B workspaces after generation.</w:t>
+      </w:r>
+    </w:p>
+    <w:p>
+      <w:pPr>
+        <w:pStyle w:val="Heading1"/>
+      </w:pPr>
+      <w:r>
+        <w:t>8. Reproducibility and Deployment</w:t>
       </w:r>
     </w:p>
     <w:p>
@@ -1635,7 +2137,7 @@
         <w:pStyle w:val="Heading1"/>
       </w:pPr>
       <w:r>
-        <w:t>8. Limitations and Next Steps</w:t>
+        <w:t>9. Limitations and Next Steps</w:t>
       </w:r>
     </w:p>
     <w:p>

</xml_diff>

<commit_message>
Improve solution paper and real dataset evidence
</commit_message>
<xml_diff>
--- a/docs/BCT_Solution_Paper.docx
+++ b/docs/BCT_Solution_Paper.docx
@@ -149,7 +149,7 @@
           </w:tcPr>
           <w:p>
             <w:r>
-              <w:t>Amazon Reviews 2023 subset: Grocery, Movies &amp; TV, Video Games, and Beauty</w:t>
+              <w:t>Real Amazon Reviews 2023 subset plus checked-in cross-domain demo fixtures</w:t>
             </w:r>
           </w:p>
         </w:tc>
@@ -165,7 +165,12 @@
     </w:p>
     <w:p>
       <w:r>
-        <w:t>The system models users as dynamic behavioral agents rather than static profiles. It combines local, reproducible scoring with retrieval-augmented Groq generation so the submission can be evaluated by machines, inspected by judges, and still run when no API key is supplied. One container exposes both required tasks: simulated reviews and personalized recommendations.</w:t>
+        <w:t>This submission builds one deployable agent studio for both required tasks in the DSN x BCT LLM Agent Challenge. The core idea is that users should not be represented as static profile labels. They should be represented as changing behavioral traces: what they rate highly, which tradeoffs they tolerate, how strongly budget matters, how they write, and what context makes a recommendation useful. The application therefore shares one dynamic persona representation across review simulation and recommendation ranking.</w:t>
+      </w:r>
+    </w:p>
+    <w:p>
+      <w:r>
+        <w:t>The system combines local, reproducible scoring with retrieval-augmented Groq generation. Local models decide ratings and recommendation order; Groq improves review fluency and explanation quality after the structured decision has already been made. This separation keeps the submission auditable for judges, measurable through offline scripts, and runnable even when API keys are absent.</w:t>
       </w:r>
     </w:p>
     <w:p>
@@ -195,6 +200,312 @@
         <w:t>Nigerian context is represented through persona fields such as location, budget, language preference, family use cases, weekday routines, harmattan weather, and local media taste.</w:t>
       </w:r>
     </w:p>
+    <w:tbl>
+      <w:tblPr>
+        <w:tblStyle w:val="TableGrid"/>
+        <w:tblW w:type="auto" w:w="0"/>
+        <w:jc w:val="left"/>
+        <w:tblLook w:firstColumn="1" w:firstRow="1" w:lastColumn="0" w:lastRow="0" w:noHBand="0" w:noVBand="1" w:val="04A0"/>
+      </w:tblPr>
+      <w:tblGrid>
+        <w:gridCol w:w="3120"/>
+        <w:gridCol w:w="3120"/>
+        <w:gridCol w:w="3120"/>
+      </w:tblGrid>
+      <w:tr>
+        <w:trPr>
+          <w:tblHeader w:val="true"/>
+          <w:cantSplit/>
+        </w:trPr>
+        <w:tc>
+          <w:tcPr>
+            <w:tcW w:type="dxa" w:w="1944"/>
+            <w:shd w:fill="EDE3D3"/>
+            <w:tcMar>
+              <w:top w:w="90" w:type="dxa"/>
+              <w:start w:w="120" w:type="dxa"/>
+              <w:bottom w:w="90" w:type="dxa"/>
+              <w:end w:w="120" w:type="dxa"/>
+            </w:tcMar>
+            <w:vAlign w:val="center"/>
+          </w:tcPr>
+          <w:p>
+            <w:r>
+              <w:rPr>
+                <w:b/>
+              </w:rPr>
+              <w:t>Requirement</w:t>
+            </w:r>
+          </w:p>
+        </w:tc>
+        <w:tc>
+          <w:tcPr>
+            <w:tcW w:type="dxa" w:w="4680"/>
+            <w:shd w:fill="EDE3D3"/>
+            <w:tcMar>
+              <w:top w:w="90" w:type="dxa"/>
+              <w:start w:w="120" w:type="dxa"/>
+              <w:bottom w:w="90" w:type="dxa"/>
+              <w:end w:w="120" w:type="dxa"/>
+            </w:tcMar>
+            <w:vAlign w:val="center"/>
+          </w:tcPr>
+          <w:p>
+            <w:r>
+              <w:rPr>
+                <w:b/>
+              </w:rPr>
+              <w:t>Implemented Evidence</w:t>
+            </w:r>
+          </w:p>
+        </w:tc>
+        <w:tc>
+          <w:tcPr>
+            <w:tcW w:type="dxa" w:w="2736"/>
+            <w:shd w:fill="EDE3D3"/>
+            <w:tcMar>
+              <w:top w:w="90" w:type="dxa"/>
+              <w:start w:w="120" w:type="dxa"/>
+              <w:bottom w:w="90" w:type="dxa"/>
+              <w:end w:w="120" w:type="dxa"/>
+            </w:tcMar>
+            <w:vAlign w:val="center"/>
+          </w:tcPr>
+          <w:p>
+            <w:r>
+              <w:rPr>
+                <w:b/>
+              </w:rPr>
+              <w:t>Judge-Facing Path</w:t>
+            </w:r>
+          </w:p>
+        </w:tc>
+      </w:tr>
+      <w:tr>
+        <w:trPr>
+          <w:cantSplit/>
+        </w:trPr>
+        <w:tc>
+          <w:tcPr>
+            <w:tcW w:type="dxa" w:w="1944"/>
+            <w:tcMar>
+              <w:top w:w="90" w:type="dxa"/>
+              <w:start w:w="120" w:type="dxa"/>
+              <w:bottom w:w="90" w:type="dxa"/>
+              <w:end w:w="120" w:type="dxa"/>
+            </w:tcMar>
+            <w:vAlign w:val="center"/>
+          </w:tcPr>
+          <w:p>
+            <w:r>
+              <w:t>Task A</w:t>
+            </w:r>
+          </w:p>
+        </w:tc>
+        <w:tc>
+          <w:tcPr>
+            <w:tcW w:type="dxa" w:w="4680"/>
+            <w:tcMar>
+              <w:top w:w="90" w:type="dxa"/>
+              <w:start w:w="120" w:type="dxa"/>
+              <w:bottom w:w="90" w:type="dxa"/>
+              <w:end w:w="120" w:type="dxa"/>
+            </w:tcMar>
+            <w:vAlign w:val="center"/>
+          </w:tcPr>
+          <w:p>
+            <w:r>
+              <w:t>Persona plus product inputs generate rating, review, confidence, reasoning, and evidence.</w:t>
+            </w:r>
+          </w:p>
+        </w:tc>
+        <w:tc>
+          <w:tcPr>
+            <w:tcW w:type="dxa" w:w="2736"/>
+            <w:tcMar>
+              <w:top w:w="90" w:type="dxa"/>
+              <w:start w:w="120" w:type="dxa"/>
+              <w:bottom w:w="90" w:type="dxa"/>
+              <w:end w:w="120" w:type="dxa"/>
+            </w:tcMar>
+            <w:vAlign w:val="center"/>
+          </w:tcPr>
+          <w:p>
+            <w:r>
+              <w:t>/task-a and POST /api/v1/generate-review</w:t>
+            </w:r>
+          </w:p>
+        </w:tc>
+      </w:tr>
+      <w:tr>
+        <w:trPr>
+          <w:cantSplit/>
+        </w:trPr>
+        <w:tc>
+          <w:tcPr>
+            <w:tcW w:type="dxa" w:w="1944"/>
+            <w:tcMar>
+              <w:top w:w="90" w:type="dxa"/>
+              <w:start w:w="120" w:type="dxa"/>
+              <w:bottom w:w="90" w:type="dxa"/>
+              <w:end w:w="120" w:type="dxa"/>
+            </w:tcMar>
+            <w:vAlign w:val="center"/>
+          </w:tcPr>
+          <w:p>
+            <w:r>
+              <w:t>Task B</w:t>
+            </w:r>
+          </w:p>
+        </w:tc>
+        <w:tc>
+          <w:tcPr>
+            <w:tcW w:type="dxa" w:w="4680"/>
+            <w:tcMar>
+              <w:top w:w="90" w:type="dxa"/>
+              <w:start w:w="120" w:type="dxa"/>
+              <w:bottom w:w="90" w:type="dxa"/>
+              <w:end w:w="120" w:type="dxa"/>
+            </w:tcMar>
+            <w:vAlign w:val="center"/>
+          </w:tcPr>
+          <w:p>
+            <w:r>
+              <w:t>Persona plus context produces ranked recommendations with explanations and matched preferences.</w:t>
+            </w:r>
+          </w:p>
+        </w:tc>
+        <w:tc>
+          <w:tcPr>
+            <w:tcW w:type="dxa" w:w="2736"/>
+            <w:tcMar>
+              <w:top w:w="90" w:type="dxa"/>
+              <w:start w:w="120" w:type="dxa"/>
+              <w:bottom w:w="90" w:type="dxa"/>
+              <w:end w:w="120" w:type="dxa"/>
+            </w:tcMar>
+            <w:vAlign w:val="center"/>
+          </w:tcPr>
+          <w:p>
+            <w:r>
+              <w:t>/task-b and POST /api/v1/recommend</w:t>
+            </w:r>
+          </w:p>
+        </w:tc>
+      </w:tr>
+      <w:tr>
+        <w:trPr>
+          <w:cantSplit/>
+        </w:trPr>
+        <w:tc>
+          <w:tcPr>
+            <w:tcW w:type="dxa" w:w="1944"/>
+            <w:tcMar>
+              <w:top w:w="90" w:type="dxa"/>
+              <w:start w:w="120" w:type="dxa"/>
+              <w:bottom w:w="90" w:type="dxa"/>
+              <w:end w:w="120" w:type="dxa"/>
+            </w:tcMar>
+            <w:vAlign w:val="center"/>
+          </w:tcPr>
+          <w:p>
+            <w:r>
+              <w:t>Solution Paper</w:t>
+            </w:r>
+          </w:p>
+        </w:tc>
+        <w:tc>
+          <w:tcPr>
+            <w:tcW w:type="dxa" w:w="4680"/>
+            <w:tcMar>
+              <w:top w:w="90" w:type="dxa"/>
+              <w:start w:w="120" w:type="dxa"/>
+              <w:bottom w:w="90" w:type="dxa"/>
+              <w:end w:w="120" w:type="dxa"/>
+            </w:tcMar>
+            <w:vAlign w:val="center"/>
+          </w:tcPr>
+          <w:p>
+            <w:r>
+              <w:t>This 4-8 page DOCX explains architecture, experiments, ablations, data, results, and limitations.</w:t>
+            </w:r>
+          </w:p>
+        </w:tc>
+        <w:tc>
+          <w:tcPr>
+            <w:tcW w:type="dxa" w:w="2736"/>
+            <w:tcMar>
+              <w:top w:w="90" w:type="dxa"/>
+              <w:start w:w="120" w:type="dxa"/>
+              <w:bottom w:w="90" w:type="dxa"/>
+              <w:end w:w="120" w:type="dxa"/>
+            </w:tcMar>
+            <w:vAlign w:val="center"/>
+          </w:tcPr>
+          <w:p>
+            <w:r>
+              <w:t>docs/BCT_Solution_Paper.docx</w:t>
+            </w:r>
+          </w:p>
+        </w:tc>
+      </w:tr>
+      <w:tr>
+        <w:trPr>
+          <w:cantSplit/>
+        </w:trPr>
+        <w:tc>
+          <w:tcPr>
+            <w:tcW w:type="dxa" w:w="1944"/>
+            <w:tcMar>
+              <w:top w:w="90" w:type="dxa"/>
+              <w:start w:w="120" w:type="dxa"/>
+              <w:bottom w:w="90" w:type="dxa"/>
+              <w:end w:w="120" w:type="dxa"/>
+            </w:tcMar>
+            <w:vAlign w:val="center"/>
+          </w:tcPr>
+          <w:p>
+            <w:r>
+              <w:t>Reproducibility</w:t>
+            </w:r>
+          </w:p>
+        </w:tc>
+        <w:tc>
+          <w:tcPr>
+            <w:tcW w:type="dxa" w:w="4680"/>
+            <w:tcMar>
+              <w:top w:w="90" w:type="dxa"/>
+              <w:start w:w="120" w:type="dxa"/>
+              <w:bottom w:w="90" w:type="dxa"/>
+              <w:end w:w="120" w:type="dxa"/>
+            </w:tcMar>
+            <w:vAlign w:val="center"/>
+          </w:tcPr>
+          <w:p>
+            <w:r>
+              <w:t>Docker, Render config, tests, fixture data, real Amazon subset, and deterministic no-key fallback.</w:t>
+            </w:r>
+          </w:p>
+        </w:tc>
+        <w:tc>
+          <w:tcPr>
+            <w:tcW w:type="dxa" w:w="2736"/>
+            <w:tcMar>
+              <w:top w:w="90" w:type="dxa"/>
+              <w:start w:w="120" w:type="dxa"/>
+              <w:bottom w:w="90" w:type="dxa"/>
+              <w:end w:w="120" w:type="dxa"/>
+            </w:tcMar>
+            <w:vAlign w:val="center"/>
+          </w:tcPr>
+          <w:p>
+            <w:r>
+              <w:t>README.md, Dockerfile, scripts/evaluate_dataset.py</w:t>
+            </w:r>
+          </w:p>
+        </w:tc>
+      </w:tr>
+    </w:tbl>
     <w:p>
       <w:pPr>
         <w:pStyle w:val="Heading1"/>
@@ -211,6 +522,11 @@
     <w:p>
       <w:r>
         <w:t>Our design treats the persona as the shared memory object between both tasks. The same signals used to explain a generated review are also used to rank recommendations, which makes the system internally consistent and easy for judges to audit.</w:t>
+      </w:r>
+    </w:p>
+    <w:p>
+      <w:r>
+        <w:t>A simple collaborative filter would be too narrow for this challenge because it can rank known items but cannot easily explain why a Lagos student, an Abuja professional, or a family shopper would respond differently to the same product. A pure LLM approach would have the opposite problem: fluent language without stable scoring. The submitted approach sits between both extremes. It uses transparent numerical features for behavioral decisions, then uses an LLM as a controlled language layer.</w:t>
       </w:r>
     </w:p>
     <w:p>
@@ -641,6 +957,64 @@
     </w:p>
     <w:p>
       <w:pPr>
+        <w:pStyle w:val="Heading2"/>
+      </w:pPr>
+      <w:r>
+        <w:t>Agentic Workflow</w:t>
+      </w:r>
+    </w:p>
+    <w:p>
+      <w:pPr>
+        <w:pStyle w:val="ListNumber"/>
+        <w:spacing w:after="100"/>
+      </w:pPr>
+      <w:r>
+        <w:t>Read the persona, stated context, and historical interactions, then summarize rating bias, category affinity, likes, dislikes, tone, and budget pressure.</w:t>
+      </w:r>
+    </w:p>
+    <w:p>
+      <w:pPr>
+        <w:pStyle w:val="ListNumber"/>
+        <w:spacing w:after="100"/>
+      </w:pPr>
+      <w:r>
+        <w:t>Retrieve the most relevant prior interactions for the current product or recommendation context.</w:t>
+      </w:r>
+    </w:p>
+    <w:p>
+      <w:pPr>
+        <w:pStyle w:val="ListNumber"/>
+        <w:spacing w:after="100"/>
+      </w:pPr>
+      <w:r>
+        <w:t>Score the behavioral decision locally: Task A predicts stars; Task B ranks candidates before any LLM text is requested.</w:t>
+      </w:r>
+    </w:p>
+    <w:p>
+      <w:pPr>
+        <w:pStyle w:val="ListNumber"/>
+        <w:spacing w:after="100"/>
+      </w:pPr>
+      <w:r>
+        <w:t>Ask Groq to verbalize only the validated result, with evidence and constraints included in the prompt.</w:t>
+      </w:r>
+    </w:p>
+    <w:p>
+      <w:pPr>
+        <w:pStyle w:val="ListNumber"/>
+        <w:spacing w:after="100"/>
+      </w:pPr>
+      <w:r>
+        <w:t>Validate the response shape and fall back to deterministic local text when the hosted model is unavailable.</w:t>
+      </w:r>
+    </w:p>
+    <w:p>
+      <w:r>
+        <w:t>This workflow is intentionally agentic but bounded. The agent reasons through memory, retrieval, scoring, and explanation, yet every external output is tied back to explicit fields that can be tested through the API.</w:t>
+      </w:r>
+    </w:p>
+    <w:p>
+      <w:pPr>
         <w:pStyle w:val="Heading1"/>
       </w:pPr>
       <w:r>
@@ -649,7 +1023,7 @@
     </w:p>
     <w:p>
       <w:r>
-        <w:t>The competition plan uses Amazon Reviews 2023 because it provides item metadata, review text, ratings, user histories, and multiple product domains. The repository ships with a small Amazon-style fixture dataset so evaluators can run the app instantly. The same schema is used for larger sampled categories.</w:t>
+        <w:t>The competition plan uses Amazon Reviews 2023 because it provides review text, ratings, user histories, item identifiers, and product categories at real platform scale. The repository now ships two data tracks. First, a small curated cross-domain fixture gives judges an instant demo without downloads. Second, a checked-in real Amazon Reviews 2023 subset supports measurable experiments across the four target domains.</w:t>
       </w:r>
     </w:p>
     <w:p>
@@ -658,7 +1032,7 @@
         <w:spacing w:after="100"/>
       </w:pPr>
       <w:r>
-        <w:t>Primary domains: Grocery and Gourmet Food, Movies and TV, Video Games, and All Beauty.</w:t>
+        <w:t>Real subset domains: Grocery and Gourmet Food, Movies and TV, Video Games, and All Beauty.</w:t>
       </w:r>
     </w:p>
     <w:p>
@@ -676,7 +1050,16 @@
         <w:spacing w:after="100"/>
       </w:pPr>
       <w:r>
-        <w:t>Cold-start support: when history is sparse, rely more heavily on item metadata, popularity, context text, and stated persona preferences.</w:t>
+        <w:t>Metadata handling: official product metadata is used when available; bounded downloads fall back to review-derived product stubs so every real review remains runnable.</w:t>
+      </w:r>
+    </w:p>
+    <w:p>
+      <w:pPr>
+        <w:pStyle w:val="ListBullet"/>
+        <w:spacing w:after="100"/>
+      </w:pPr>
+      <w:r>
+        <w:t>Cold-start support: when history is sparse, rely more heavily on item/category priors, popularity, context text, and stated persona preferences.</w:t>
       </w:r>
     </w:p>
     <w:tbl>
@@ -698,7 +1081,7 @@
         </w:trPr>
         <w:tc>
           <w:tcPr>
-            <w:tcW w:type="dxa" w:w="2448"/>
+            <w:tcW w:type="dxa" w:w="2232"/>
             <w:shd w:fill="EDE3D3"/>
             <w:tcMar>
               <w:top w:w="90" w:type="dxa"/>
@@ -713,13 +1096,13 @@
               <w:rPr>
                 <w:b/>
               </w:rPr>
-              <w:t>Smoke Subset</w:t>
+              <w:t>Real Amazon Subset</w:t>
             </w:r>
           </w:p>
         </w:tc>
         <w:tc>
           <w:tcPr>
-            <w:tcW w:type="dxa" w:w="2015"/>
+            <w:tcW w:type="dxa" w:w="3096"/>
             <w:shd w:fill="EDE3D3"/>
             <w:tcMar>
               <w:top w:w="90" w:type="dxa"/>
@@ -740,7 +1123,7 @@
         </w:tc>
         <w:tc>
           <w:tcPr>
-            <w:tcW w:type="dxa" w:w="4896"/>
+            <w:tcW w:type="dxa" w:w="4031"/>
             <w:shd w:fill="EDE3D3"/>
             <w:tcMar>
               <w:top w:w="90" w:type="dxa"/>
@@ -766,7 +1149,7 @@
         </w:trPr>
         <w:tc>
           <w:tcPr>
-            <w:tcW w:type="dxa" w:w="2448"/>
+            <w:tcW w:type="dxa" w:w="2232"/>
             <w:tcMar>
               <w:top w:w="90" w:type="dxa"/>
               <w:start w:w="120" w:type="dxa"/>
@@ -783,7 +1166,7 @@
         </w:tc>
         <w:tc>
           <w:tcPr>
-            <w:tcW w:type="dxa" w:w="2015"/>
+            <w:tcW w:type="dxa" w:w="3096"/>
             <w:tcMar>
               <w:top w:w="90" w:type="dxa"/>
               <w:start w:w="120" w:type="dxa"/>
@@ -800,7 +1183,7 @@
         </w:tc>
         <w:tc>
           <w:tcPr>
-            <w:tcW w:type="dxa" w:w="4896"/>
+            <w:tcW w:type="dxa" w:w="4031"/>
             <w:tcMar>
               <w:top w:w="90" w:type="dxa"/>
               <w:start w:w="120" w:type="dxa"/>
@@ -811,7 +1194,7 @@
           </w:tcPr>
           <w:p>
             <w:r>
-              <w:t>Official McAuley Lab review and metadata JSONL.GZ files</w:t>
+              <w:t>Official McAuley Lab review files; metadata stream supported when available</w:t>
             </w:r>
           </w:p>
         </w:tc>
@@ -822,7 +1205,63 @@
         </w:trPr>
         <w:tc>
           <w:tcPr>
-            <w:tcW w:type="dxa" w:w="2448"/>
+            <w:tcW w:type="dxa" w:w="2232"/>
+            <w:tcMar>
+              <w:top w:w="90" w:type="dxa"/>
+              <w:start w:w="120" w:type="dxa"/>
+              <w:bottom w:w="90" w:type="dxa"/>
+              <w:end w:w="120" w:type="dxa"/>
+            </w:tcMar>
+            <w:vAlign w:val="center"/>
+          </w:tcPr>
+          <w:p>
+            <w:r>
+              <w:t>Categories</w:t>
+            </w:r>
+          </w:p>
+        </w:tc>
+        <w:tc>
+          <w:tcPr>
+            <w:tcW w:type="dxa" w:w="3096"/>
+            <w:tcMar>
+              <w:top w:w="90" w:type="dxa"/>
+              <w:start w:w="120" w:type="dxa"/>
+              <w:bottom w:w="90" w:type="dxa"/>
+              <w:end w:w="120" w:type="dxa"/>
+            </w:tcMar>
+            <w:vAlign w:val="center"/>
+          </w:tcPr>
+          <w:p>
+            <w:r>
+              <w:t>All_Beauty, Grocery_and_Gourmet_Food, Movies_and_TV, Video_Games</w:t>
+            </w:r>
+          </w:p>
+        </w:tc>
+        <w:tc>
+          <w:tcPr>
+            <w:tcW w:type="dxa" w:w="4031"/>
+            <w:tcMar>
+              <w:top w:w="90" w:type="dxa"/>
+              <w:start w:w="120" w:type="dxa"/>
+              <w:bottom w:w="90" w:type="dxa"/>
+              <w:end w:w="120" w:type="dxa"/>
+            </w:tcMar>
+            <w:vAlign w:val="center"/>
+          </w:tcPr>
+          <w:p>
+            <w:r>
+              <w:t>The four challenge demo domains are represented</w:t>
+            </w:r>
+          </w:p>
+        </w:tc>
+      </w:tr>
+      <w:tr>
+        <w:trPr>
+          <w:cantSplit/>
+        </w:trPr>
+        <w:tc>
+          <w:tcPr>
+            <w:tcW w:type="dxa" w:w="2232"/>
             <w:tcMar>
               <w:top w:w="90" w:type="dxa"/>
               <w:start w:w="120" w:type="dxa"/>
@@ -839,7 +1278,7 @@
         </w:tc>
         <w:tc>
           <w:tcPr>
-            <w:tcW w:type="dxa" w:w="2015"/>
+            <w:tcW w:type="dxa" w:w="3096"/>
             <w:tcMar>
               <w:top w:w="90" w:type="dxa"/>
               <w:start w:w="120" w:type="dxa"/>
@@ -850,13 +1289,13 @@
           </w:tcPr>
           <w:p>
             <w:r>
-              <w:t>21</w:t>
+              <w:t>252</w:t>
             </w:r>
           </w:p>
         </w:tc>
         <w:tc>
           <w:tcPr>
-            <w:tcW w:type="dxa" w:w="4896"/>
+            <w:tcW w:type="dxa" w:w="4031"/>
             <w:tcMar>
               <w:top w:w="90" w:type="dxa"/>
               <w:start w:w="120" w:type="dxa"/>
@@ -867,7 +1306,7 @@
           </w:tcPr>
           <w:p>
             <w:r>
-              <w:t>Normalized candidate products in the smoke run</w:t>
+              <w:t>Normalized candidate products in the checked-in subset</w:t>
             </w:r>
           </w:p>
         </w:tc>
@@ -878,7 +1317,7 @@
         </w:trPr>
         <w:tc>
           <w:tcPr>
-            <w:tcW w:type="dxa" w:w="2448"/>
+            <w:tcW w:type="dxa" w:w="2232"/>
             <w:tcMar>
               <w:top w:w="90" w:type="dxa"/>
               <w:start w:w="120" w:type="dxa"/>
@@ -895,7 +1334,7 @@
         </w:tc>
         <w:tc>
           <w:tcPr>
-            <w:tcW w:type="dxa" w:w="2015"/>
+            <w:tcW w:type="dxa" w:w="3096"/>
             <w:tcMar>
               <w:top w:w="90" w:type="dxa"/>
               <w:start w:w="120" w:type="dxa"/>
@@ -906,13 +1345,13 @@
           </w:tcPr>
           <w:p>
             <w:r>
-              <w:t>27</w:t>
+              <w:t>265</w:t>
             </w:r>
           </w:p>
         </w:tc>
         <w:tc>
           <w:tcPr>
-            <w:tcW w:type="dxa" w:w="4896"/>
+            <w:tcW w:type="dxa" w:w="4031"/>
             <w:tcMar>
               <w:top w:w="90" w:type="dxa"/>
               <w:start w:w="120" w:type="dxa"/>
@@ -923,7 +1362,7 @@
           </w:tcPr>
           <w:p>
             <w:r>
-              <w:t>Real review texts and ratings after filtering</w:t>
+              <w:t>Real review texts and star ratings after filtering</w:t>
             </w:r>
           </w:p>
         </w:tc>
@@ -934,7 +1373,7 @@
         </w:trPr>
         <w:tc>
           <w:tcPr>
-            <w:tcW w:type="dxa" w:w="2448"/>
+            <w:tcW w:type="dxa" w:w="2232"/>
             <w:tcMar>
               <w:top w:w="90" w:type="dxa"/>
               <w:start w:w="120" w:type="dxa"/>
@@ -951,7 +1390,7 @@
         </w:tc>
         <w:tc>
           <w:tcPr>
-            <w:tcW w:type="dxa" w:w="2015"/>
+            <w:tcW w:type="dxa" w:w="3096"/>
             <w:tcMar>
               <w:top w:w="90" w:type="dxa"/>
               <w:start w:w="120" w:type="dxa"/>
@@ -962,13 +1401,13 @@
           </w:tcPr>
           <w:p>
             <w:r>
-              <w:t>8</w:t>
+              <w:t>70</w:t>
             </w:r>
           </w:p>
         </w:tc>
         <w:tc>
           <w:tcPr>
-            <w:tcW w:type="dxa" w:w="4896"/>
+            <w:tcW w:type="dxa" w:w="4031"/>
             <w:tcMar>
               <w:top w:w="90" w:type="dxa"/>
               <w:start w:w="120" w:type="dxa"/>
@@ -979,7 +1418,63 @@
           </w:tcPr>
           <w:p>
             <w:r>
-              <w:t>Users with enough chronological behavior for holdout testing</w:t>
+              <w:t>Users contributing chronological behavior for train/test splits</w:t>
+            </w:r>
+          </w:p>
+        </w:tc>
+      </w:tr>
+      <w:tr>
+        <w:trPr>
+          <w:cantSplit/>
+        </w:trPr>
+        <w:tc>
+          <w:tcPr>
+            <w:tcW w:type="dxa" w:w="2232"/>
+            <w:tcMar>
+              <w:top w:w="90" w:type="dxa"/>
+              <w:start w:w="120" w:type="dxa"/>
+              <w:bottom w:w="90" w:type="dxa"/>
+              <w:end w:w="120" w:type="dxa"/>
+            </w:tcMar>
+            <w:vAlign w:val="center"/>
+          </w:tcPr>
+          <w:p>
+            <w:r>
+              <w:t>Holdout</w:t>
+            </w:r>
+          </w:p>
+        </w:tc>
+        <w:tc>
+          <w:tcPr>
+            <w:tcW w:type="dxa" w:w="3096"/>
+            <w:tcMar>
+              <w:top w:w="90" w:type="dxa"/>
+              <w:start w:w="120" w:type="dxa"/>
+              <w:bottom w:w="90" w:type="dxa"/>
+              <w:end w:w="120" w:type="dxa"/>
+            </w:tcMar>
+            <w:vAlign w:val="center"/>
+          </w:tcPr>
+          <w:p>
+            <w:r>
+              <w:t>179 train / 86 test</w:t>
+            </w:r>
+          </w:p>
+        </w:tc>
+        <w:tc>
+          <w:tcPr>
+            <w:tcW w:type="dxa" w:w="4031"/>
+            <w:tcMar>
+              <w:top w:w="90" w:type="dxa"/>
+              <w:start w:w="120" w:type="dxa"/>
+              <w:bottom w:w="90" w:type="dxa"/>
+              <w:end w:w="120" w:type="dxa"/>
+            </w:tcMar>
+            <w:vAlign w:val="center"/>
+          </w:tcPr>
+          <w:p>
+            <w:r>
+              <w:t>Most recent interaction held out by user when possible</w:t>
             </w:r>
           </w:p>
         </w:tc>
@@ -991,6 +1486,11 @@
       </w:pPr>
       <w:r>
         <w:t>4. Experiments and Ablations</w:t>
+      </w:r>
+    </w:p>
+    <w:p>
+      <w:r>
+        <w:t>The experiments are designed to answer a practical judge question: does the system understand the user, or is it merely producing plausible text? Each baseline removes one source of behavioral signal. Rating accuracy is measured with RMSE; ranking quality is measured with NDCG@10 and Hit Rate@10. Review text quality can be scored with ROUGE-L/BERTScore when the optional NLP metric dependencies are available, but the paper prioritizes behavioral ablations because they are the clearest evidence of user modeling.</w:t>
       </w:r>
     </w:p>
     <w:tbl>
@@ -1356,6 +1856,11 @@
       </w:tr>
     </w:tbl>
     <w:p>
+      <w:r>
+        <w:t>The cold-start and cross-domain cases are especially important for the hackathon rubric. The ranker does not require a user to have prior reviews in the same category. It can use explicit persona fields, context text, budget level, category priors, and product popularity to make a reasonable first recommendation, then become more personalized as history grows.</w:t>
+      </w:r>
+    </w:p>
+    <w:p>
       <w:pPr>
         <w:pStyle w:val="Heading1"/>
       </w:pPr>
@@ -1365,7 +1870,7 @@
     </w:p>
     <w:p>
       <w:r>
-        <w:t>The repository includes both a hand-checkable fixture split and a real Amazon Reviews 2023 smoke subset. The Amazon smoke subset is still small, but it proves that the same code path can stream official data, normalize metadata, create chronological user splits, and compare personalized models against baselines.</w:t>
+        <w:t>The repository includes both a hand-checkable fixture split and a real Amazon Reviews 2023 multi-domain subset. The subset is intentionally bounded so it can be committed and inspected, but it proves that the same code path can stream official data, normalize product candidates, create chronological user splits, and compare personalized models against baselines.</w:t>
       </w:r>
     </w:p>
     <w:tbl>
@@ -1505,7 +2010,7 @@
           </w:tcPr>
           <w:p>
             <w:r>
-              <w:t>0.8734</w:t>
+              <w:t>0.7357</w:t>
             </w:r>
           </w:p>
         </w:tc>
@@ -1522,7 +2027,7 @@
           </w:tcPr>
           <w:p>
             <w:r>
-              <w:t>1.3935</w:t>
+              <w:t>1.3133</w:t>
             </w:r>
           </w:p>
         </w:tc>
@@ -1539,7 +2044,7 @@
           </w:tcPr>
           <w:p>
             <w:r>
-              <w:t>0.5201</w:t>
+              <w:t>0.5776</w:t>
             </w:r>
           </w:p>
         </w:tc>
@@ -1578,7 +2083,7 @@
           </w:tcPr>
           <w:p>
             <w:r>
-              <w:t>0.1879</w:t>
+              <w:t>0.0481</w:t>
             </w:r>
           </w:p>
         </w:tc>
@@ -1595,7 +2100,7 @@
           </w:tcPr>
           <w:p>
             <w:r>
-              <w:t>0.0413</w:t>
+              <w:t>0.0194</w:t>
             </w:r>
           </w:p>
         </w:tc>
@@ -1612,7 +2117,7 @@
           </w:tcPr>
           <w:p>
             <w:r>
-              <w:t>0.1466</w:t>
+              <w:t>0.0287</w:t>
             </w:r>
           </w:p>
         </w:tc>
@@ -1651,7 +2156,7 @@
           </w:tcPr>
           <w:p>
             <w:r>
-              <w:t>0.2857</w:t>
+              <w:t>0.1163</w:t>
             </w:r>
           </w:p>
         </w:tc>
@@ -1668,7 +2173,7 @@
           </w:tcPr>
           <w:p>
             <w:r>
-              <w:t>0.1429</w:t>
+              <w:t>0.0349</w:t>
             </w:r>
           </w:p>
         </w:tc>
@@ -1694,6 +2199,11 @@
     <w:p>
       <w:r>
         <w:t>The most important signal is not the absolute value of the smoke score; it is the direction of the ablation. Personalized rating and ranking beat non-personalized baselines on the same held-out interactions.</w:t>
+      </w:r>
+    </w:p>
+    <w:p>
+      <w:r>
+        <w:t>The current ranking scores are modest because the checked-in subset is small and sparse, which is expected for a lightweight repository artifact. The important result is that the personalized ranker improves over popularity-only ranking while remaining interpretable. A larger subset should increase candidate density and produce more stable NDCG values.</w:t>
       </w:r>
     </w:p>
     <w:p>
@@ -1906,6 +2416,11 @@
     <w:p>
       <w:r>
         <w:t>A third demo persona, a Port Harcourt family shopper, covers home use, visitors, children, family-safe media, easy guest drinks, and gentle skincare.</w:t>
+      </w:r>
+    </w:p>
+    <w:p>
+      <w:r>
+        <w:t>The application also adds a voice layer through YarnGPT. Judges can generate the standard review or recommendation, convert the explanation into Nigerian Pidgin, Yoruba-flavoured English, Hausa-flavoured English, Igbo-flavoured English, or a formal judge summary, and play hosted audio when a YarnGPT key is configured. This does not change the underlying score; it changes how the explanation is delivered to a local audience.</w:t>
       </w:r>
     </w:p>
     <w:p>
@@ -2129,9 +2644,273 @@
         <w:spacing w:after="100"/>
       </w:pPr>
       <w:r>
-        <w:t>Use /api/v1/generate-review, /api/v1/recommend, /api/v1/evaluation, scripts/evaluate.py, and scripts/build_dataset.py for scoring and larger Amazon subset runs.</w:t>
+        <w:t>Set YARNGPT_API_KEY to enable hosted audio, or omit it to use browser speech fallback.</w:t>
       </w:r>
     </w:p>
+    <w:p>
+      <w:pPr>
+        <w:pStyle w:val="ListNumber"/>
+        <w:spacing w:after="100"/>
+      </w:pPr>
+      <w:r>
+        <w:t>Use /api/v1/generate-review, /api/v1/recommend, /api/v1/evaluation, scripts/evaluate.py, scripts/download_amazon_subset.py, and scripts/evaluate_dataset.py for scoring and larger Amazon subset runs.</w:t>
+      </w:r>
+    </w:p>
+    <w:tbl>
+      <w:tblPr>
+        <w:tblStyle w:val="TableGrid"/>
+        <w:tblW w:type="auto" w:w="0"/>
+        <w:jc w:val="left"/>
+        <w:tblLook w:firstColumn="1" w:firstRow="1" w:lastColumn="0" w:lastRow="0" w:noHBand="0" w:noVBand="1" w:val="04A0"/>
+      </w:tblPr>
+      <w:tblGrid>
+        <w:gridCol w:w="4680"/>
+        <w:gridCol w:w="4680"/>
+      </w:tblGrid>
+      <w:tr>
+        <w:trPr>
+          <w:tblHeader w:val="true"/>
+          <w:cantSplit/>
+        </w:trPr>
+        <w:tc>
+          <w:tcPr>
+            <w:tcW w:type="dxa" w:w="3024"/>
+            <w:shd w:fill="EDE3D3"/>
+            <w:tcMar>
+              <w:top w:w="90" w:type="dxa"/>
+              <w:start w:w="120" w:type="dxa"/>
+              <w:bottom w:w="90" w:type="dxa"/>
+              <w:end w:w="120" w:type="dxa"/>
+            </w:tcMar>
+            <w:vAlign w:val="center"/>
+          </w:tcPr>
+          <w:p>
+            <w:r>
+              <w:rPr>
+                <w:b/>
+              </w:rPr>
+              <w:t>Artifact</w:t>
+            </w:r>
+          </w:p>
+        </w:tc>
+        <w:tc>
+          <w:tcPr>
+            <w:tcW w:type="dxa" w:w="6336"/>
+            <w:shd w:fill="EDE3D3"/>
+            <w:tcMar>
+              <w:top w:w="90" w:type="dxa"/>
+              <w:start w:w="120" w:type="dxa"/>
+              <w:bottom w:w="90" w:type="dxa"/>
+              <w:end w:w="120" w:type="dxa"/>
+            </w:tcMar>
+            <w:vAlign w:val="center"/>
+          </w:tcPr>
+          <w:p>
+            <w:r>
+              <w:rPr>
+                <w:b/>
+              </w:rPr>
+              <w:t>Purpose</w:t>
+            </w:r>
+          </w:p>
+        </w:tc>
+      </w:tr>
+      <w:tr>
+        <w:trPr>
+          <w:cantSplit/>
+        </w:trPr>
+        <w:tc>
+          <w:tcPr>
+            <w:tcW w:type="dxa" w:w="3024"/>
+            <w:tcMar>
+              <w:top w:w="90" w:type="dxa"/>
+              <w:start w:w="120" w:type="dxa"/>
+              <w:bottom w:w="90" w:type="dxa"/>
+              <w:end w:w="120" w:type="dxa"/>
+            </w:tcMar>
+            <w:vAlign w:val="center"/>
+          </w:tcPr>
+          <w:p>
+            <w:r>
+              <w:t>Dockerfile / docker-compose.yml</w:t>
+            </w:r>
+          </w:p>
+        </w:tc>
+        <w:tc>
+          <w:tcPr>
+            <w:tcW w:type="dxa" w:w="6336"/>
+            <w:tcMar>
+              <w:top w:w="90" w:type="dxa"/>
+              <w:start w:w="120" w:type="dxa"/>
+              <w:bottom w:w="90" w:type="dxa"/>
+              <w:end w:w="120" w:type="dxa"/>
+            </w:tcMar>
+            <w:vAlign w:val="center"/>
+          </w:tcPr>
+          <w:p>
+            <w:r>
+              <w:t>Containerized local verification for judges</w:t>
+            </w:r>
+          </w:p>
+        </w:tc>
+      </w:tr>
+      <w:tr>
+        <w:trPr>
+          <w:cantSplit/>
+        </w:trPr>
+        <w:tc>
+          <w:tcPr>
+            <w:tcW w:type="dxa" w:w="3024"/>
+            <w:tcMar>
+              <w:top w:w="90" w:type="dxa"/>
+              <w:start w:w="120" w:type="dxa"/>
+              <w:bottom w:w="90" w:type="dxa"/>
+              <w:end w:w="120" w:type="dxa"/>
+            </w:tcMar>
+            <w:vAlign w:val="center"/>
+          </w:tcPr>
+          <w:p>
+            <w:r>
+              <w:t>render.yaml</w:t>
+            </w:r>
+          </w:p>
+        </w:tc>
+        <w:tc>
+          <w:tcPr>
+            <w:tcW w:type="dxa" w:w="6336"/>
+            <w:tcMar>
+              <w:top w:w="90" w:type="dxa"/>
+              <w:start w:w="120" w:type="dxa"/>
+              <w:bottom w:w="90" w:type="dxa"/>
+              <w:end w:w="120" w:type="dxa"/>
+            </w:tcMar>
+            <w:vAlign w:val="center"/>
+          </w:tcPr>
+          <w:p>
+            <w:r>
+              <w:t>Deployment blueprint for the hosted demo</w:t>
+            </w:r>
+          </w:p>
+        </w:tc>
+      </w:tr>
+      <w:tr>
+        <w:trPr>
+          <w:cantSplit/>
+        </w:trPr>
+        <w:tc>
+          <w:tcPr>
+            <w:tcW w:type="dxa" w:w="3024"/>
+            <w:tcMar>
+              <w:top w:w="90" w:type="dxa"/>
+              <w:start w:w="120" w:type="dxa"/>
+              <w:bottom w:w="90" w:type="dxa"/>
+              <w:end w:w="120" w:type="dxa"/>
+            </w:tcMar>
+            <w:vAlign w:val="center"/>
+          </w:tcPr>
+          <w:p>
+            <w:r>
+              <w:t>tests/</w:t>
+            </w:r>
+          </w:p>
+        </w:tc>
+        <w:tc>
+          <w:tcPr>
+            <w:tcW w:type="dxa" w:w="6336"/>
+            <w:tcMar>
+              <w:top w:w="90" w:type="dxa"/>
+              <w:start w:w="120" w:type="dxa"/>
+              <w:bottom w:w="90" w:type="dxa"/>
+              <w:end w:w="120" w:type="dxa"/>
+            </w:tcMar>
+            <w:vAlign w:val="center"/>
+          </w:tcPr>
+          <w:p>
+            <w:r>
+              <w:t>Unit and integration checks for schemas, scoring, generation, fallback, and API behavior</w:t>
+            </w:r>
+          </w:p>
+        </w:tc>
+      </w:tr>
+      <w:tr>
+        <w:trPr>
+          <w:cantSplit/>
+        </w:trPr>
+        <w:tc>
+          <w:tcPr>
+            <w:tcW w:type="dxa" w:w="3024"/>
+            <w:tcMar>
+              <w:top w:w="90" w:type="dxa"/>
+              <w:start w:w="120" w:type="dxa"/>
+              <w:bottom w:w="90" w:type="dxa"/>
+              <w:end w:w="120" w:type="dxa"/>
+            </w:tcMar>
+            <w:vAlign w:val="center"/>
+          </w:tcPr>
+          <w:p>
+            <w:r>
+              <w:t>data/amazon_subset</w:t>
+            </w:r>
+          </w:p>
+        </w:tc>
+        <w:tc>
+          <w:tcPr>
+            <w:tcW w:type="dxa" w:w="6336"/>
+            <w:tcMar>
+              <w:top w:w="90" w:type="dxa"/>
+              <w:start w:w="120" w:type="dxa"/>
+              <w:bottom w:w="90" w:type="dxa"/>
+              <w:end w:w="120" w:type="dxa"/>
+            </w:tcMar>
+            <w:vAlign w:val="center"/>
+          </w:tcPr>
+          <w:p>
+            <w:r>
+              <w:t>Checked-in real Amazon Reviews 2023 subset used for the latest paper metrics</w:t>
+            </w:r>
+          </w:p>
+        </w:tc>
+      </w:tr>
+      <w:tr>
+        <w:trPr>
+          <w:cantSplit/>
+        </w:trPr>
+        <w:tc>
+          <w:tcPr>
+            <w:tcW w:type="dxa" w:w="3024"/>
+            <w:tcMar>
+              <w:top w:w="90" w:type="dxa"/>
+              <w:start w:w="120" w:type="dxa"/>
+              <w:bottom w:w="90" w:type="dxa"/>
+              <w:end w:w="120" w:type="dxa"/>
+            </w:tcMar>
+            <w:vAlign w:val="center"/>
+          </w:tcPr>
+          <w:p>
+            <w:r>
+              <w:t>data/fixtures</w:t>
+            </w:r>
+          </w:p>
+        </w:tc>
+        <w:tc>
+          <w:tcPr>
+            <w:tcW w:type="dxa" w:w="6336"/>
+            <w:tcMar>
+              <w:top w:w="90" w:type="dxa"/>
+              <w:start w:w="120" w:type="dxa"/>
+              <w:bottom w:w="90" w:type="dxa"/>
+              <w:end w:w="120" w:type="dxa"/>
+            </w:tcMar>
+            <w:vAlign w:val="center"/>
+          </w:tcPr>
+          <w:p>
+            <w:r>
+              <w:t>Deterministic cross-domain UI demo data that works without network access</w:t>
+            </w:r>
+          </w:p>
+        </w:tc>
+      </w:tr>
+    </w:tbl>
     <w:p>
       <w:pPr>
         <w:pStyle w:val="Heading1"/>
@@ -2142,7 +2921,12 @@
     </w:p>
     <w:p>
       <w:r>
-        <w:t>The current build is optimized for deadline reliability and judge reproducibility. The main limitation is that the repository includes a small fixture dataset rather than the full Amazon corpus. With more time, we would add embedding indexes, larger sampled evaluation, rating calibration, multi-turn conversational memory, and real Nigerian marketplace data.</w:t>
+        <w:t>The current build is optimized for deadline reliability and judge reproducibility. The main limitation is that the checked-in Amazon subset is still much smaller than the full corpus, and some product metadata in the bounded subset is review-derived when official metadata streaming is incomplete. With more time, we would add embedding indexes, larger sampled evaluation, rating calibration, multi-turn conversational memory, richer BERTScore evaluation, and real Nigerian marketplace data.</w:t>
+      </w:r>
+    </w:p>
+    <w:p>
+      <w:r>
+        <w:t>The strongest next experiment would be a larger four-category run with dense product metadata and an embedding index for candidate generation. That would let the same agent workflow scale from a polished hackathon demo into a stronger production recommender.</w:t>
       </w:r>
     </w:p>
     <w:p>

</xml_diff>